<commit_message>
build(submission): rebuild package with international-standard Ch5 upgrades + kappa
Propagate the §5.1.8 golden-thread, §5.3.0 contribution framing, §5.3.8 boundary
conditions, and reference additions into the package deliverables. Full
dissertation PDF now 157pp; ch5 + references docx/pdf refreshed; English kappa
(pdf+docx) included in 3_luan_an_chuong_phu_luc/.

Co-Authored-By: Claude Opus 4.8 (1M context) <noreply@anthropic.com>
Claude-Session: https://claude.ai/code/session_01Xumaoraa2DLWLXsgJJ62oq
</commit_message>
<xml_diff>
--- a/dist/BO_NOP_HOAN_CHINH_2026-06/3_luan_an_chuong_phu_luc/04_references_apa7.docx
+++ b/dist/BO_NOP_HOAN_CHINH_2026-06/3_luan_an_chuong_phu_luc/04_references_apa7.docx
@@ -1983,6 +1983,27 @@
         <w:pStyle w:val="BodyText"/>
       </w:pPr>
       <w:r>
+        <w:t xml:space="preserve">Corley, K. G., &amp; Gioia, D. A. (2011). Building theory about theory building: What constitutes a theoretical contribution?</w:t>
+      </w:r>
+      <w:r>
+        <w:t xml:space="preserve"> </w:t>
+      </w:r>
+      <w:r>
+        <w:rPr>
+          <w:iCs/>
+          <w:i/>
+        </w:rPr>
+        <w:t xml:space="preserve">Academy of Management Review, 36</w:t>
+      </w:r>
+      <w:r>
+        <w:t xml:space="preserve">(1), 12–32. https://doi.org/10.5465/amr.2009.0486</w:t>
+      </w:r>
+    </w:p>
+    <w:p>
+      <w:pPr>
+        <w:pStyle w:val="BodyText"/>
+      </w:pPr>
+      <w:r>
         <w:t xml:space="preserve">Cooper, H. (2010).</w:t>
       </w:r>
       <w:r>
@@ -4534,6 +4555,27 @@
         <w:pStyle w:val="BodyText"/>
       </w:pPr>
       <w:r>
+        <w:t xml:space="preserve">Melitz, M. J. (2003). The impact of trade on intra-industry reallocations and aggregate industry productivity.</w:t>
+      </w:r>
+      <w:r>
+        <w:t xml:space="preserve"> </w:t>
+      </w:r>
+      <w:r>
+        <w:rPr>
+          <w:iCs/>
+          <w:i/>
+        </w:rPr>
+        <w:t xml:space="preserve">Econometrica, 71</w:t>
+      </w:r>
+      <w:r>
+        <w:t xml:space="preserve">(6), 1695–1725. https://doi.org/10.1111/1468-0262.00467</w:t>
+      </w:r>
+    </w:p>
+    <w:p>
+      <w:pPr>
+        <w:pStyle w:val="BodyText"/>
+      </w:pPr>
+      <w:r>
         <w:t xml:space="preserve">Meyer, K. E., van Witteloostuijn, A., &amp; Beugelsdijk, S. (2017). What’s in a p? Reassessing best practices for conducting and reporting hypothesis-testing research.</w:t>
       </w:r>
       <w:r>
@@ -6712,6 +6754,27 @@
       </w:r>
       <w:r>
         <w:t xml:space="preserve">(2), 171–180. https://doi.org/10.1002/smj.4250050207</w:t>
+      </w:r>
+    </w:p>
+    <w:p>
+      <w:pPr>
+        <w:pStyle w:val="BodyText"/>
+      </w:pPr>
+      <w:r>
+        <w:t xml:space="preserve">Whetten, D. A. (1989). What constitutes a theoretical contribution?</w:t>
+      </w:r>
+      <w:r>
+        <w:t xml:space="preserve"> </w:t>
+      </w:r>
+      <w:r>
+        <w:rPr>
+          <w:iCs/>
+          <w:i/>
+        </w:rPr>
+        <w:t xml:space="preserve">Academy of Management Review, 14</w:t>
+      </w:r>
+      <w:r>
+        <w:t xml:space="preserve">(4), 490–495. https://doi.org/10.5465/amr.1989.4308371</w:t>
       </w:r>
     </w:p>
     <w:p>

</xml_diff>